<commit_message>
Update workflow rules UI, simulation recovery, and project docs
</commit_message>
<xml_diff>
--- a/Codex工作流监视器项目说明.docx
+++ b/Codex工作流监视器项目说明.docx
@@ -111,13 +111,7 @@
         <w:jc w:val="center"/>
       </w:pPr>
       <w:r>
-        <w:rPr>
-          <w:rFonts w:ascii="Calibri" w:hAnsi="Calibri" w:eastAsia="Microsoft YaHei"/>
-          <w:b/>
-          <w:color w:val="637083"/>
-          <w:sz w:val="22"/>
-        </w:rPr>
-        <w:t>团队内部项目说明  |  初版交付</w:t>
+        <w:t>团队内部项目说明  |  更新版</w:t>
       </w:r>
     </w:p>
     <w:p>
@@ -144,7 +138,7 @@
     </w:p>
     <w:p>
       <w:r>
-        <w:t>Codex 工作流监视器是一套面向 Codex Desktop 本地会话的观察与分析工具。它不启动第二个 Codex，也不修改 Codex 的状态数据库，而是持续读取 Codex 已公开并写入本地会话目录的 JSONL 事件，通过统一事件模型、五类分析视图和 AWDL 规则检测，帮助团队理解 Agent 当前在做什么、是否取得进展，以及何时出现重复重试、活锁或停滞。</w:t>
+        <w:t>Codex 工作流监视器是一套面向 Codex Desktop 本地会话的观察与分析工具。它不启动第二个 Codex，也不修改 Codex 的状态数据库，而是持续读取 Codex 已公开并写入本地会话目录的 JSONL 事件，通过统一事件模型、六类分析视图和 AWDL 规则检测，帮助团队理解 Agent 当前在做什么、是否取得进展，以及何时出现重复重试、活锁或停滞。</w:t>
       </w:r>
     </w:p>
     <w:tbl>
@@ -523,16 +517,8 @@
             </w:tcMar>
           </w:tcPr>
           <w:p>
-            <w:pPr>
-              <w:spacing w:after="0" w:line="259" w:lineRule="auto"/>
-            </w:pPr>
             <w:r>
-              <w:rPr>
-                <w:rFonts w:ascii="Calibri" w:hAnsi="Calibri" w:eastAsia="Microsoft YaHei"/>
-                <w:color w:val="26384B"/>
-                <w:sz w:val="19"/>
-              </w:rPr>
-              <w:t>仅在用户确认终止演练告警时，通过已识别的当前会话执行中断。</w:t>
+              <w:t>仅在用户确认终止演练告警时，对已识别的当前可见会话执行中断。</w:t>
             </w:r>
           </w:p>
         </w:tc>
@@ -570,7 +556,7 @@
         <w:pStyle w:val="Heading2"/>
       </w:pPr>
       <w:r>
-        <w:t>2.2 五种分析视图</w:t>
+        <w:t>2.2 六种分析视图</w:t>
       </w:r>
     </w:p>
     <w:tbl>
@@ -736,16 +722,40 @@
             </w:tcMar>
           </w:tcPr>
           <w:p>
-            <w:pPr>
-              <w:spacing w:after="0" w:line="259" w:lineRule="auto"/>
-            </w:pPr>
             <w:r>
-              <w:rPr>
-                <w:rFonts w:ascii="Calibri" w:hAnsi="Calibri" w:eastAsia="Microsoft YaHei"/>
-                <w:color w:val="26384B"/>
-                <w:sz w:val="19"/>
-              </w:rPr>
-              <w:t>状态节点、正常/进展连线、告警回边、自动滚动历史</w:t>
+              <w:t>状态节点、成功结果和告警证据标识、告警回边、自动滚动历史</w:t>
+            </w:r>
+          </w:p>
+        </w:tc>
+      </w:tr>
+      <w:tr>
+        <w:tc>
+          <w:tcPr>
+            <w:tcW w:type="dxa" w:w="1500"/>
+          </w:tcPr>
+          <w:p>
+            <w:r>
+              <w:t>判错规则</w:t>
+            </w:r>
+          </w:p>
+        </w:tc>
+        <w:tc>
+          <w:tcPr>
+            <w:tcW w:type="dxa" w:w="3000"/>
+          </w:tcPr>
+          <w:p>
+            <w:r>
+              <w:t>逐项解释当前 AWDL 的触发条件</w:t>
+            </w:r>
+          </w:p>
+        </w:tc>
+        <w:tc>
+          <w:tcPr>
+            <w:tcW w:type="dxa" w:w="4860"/>
+          </w:tcPr>
+          <w:p>
+            <w:r>
+              <w:t>动态阈值、是否触发、证据事件编号及判定边界</w:t>
             </w:r>
           </w:p>
         </w:tc>
@@ -1347,6 +1357,58 @@
     </w:p>
     <w:p>
       <w:pPr>
+        <w:pStyle w:val="Heading2"/>
+      </w:pPr>
+      <w:r>
+        <w:t>2.5 判错规则与工作流图</w:t>
+      </w:r>
+    </w:p>
+    <w:p>
+      <w:pPr/>
+      <w:r>
+        <w:t>工作流图展示事件发生顺序，不直接宣告一整条轨迹正确。普通节点仅表示已观察到事件；绿色节点表示工具成功返回或本轮完成；红色节点表示被 AWDL 告警引用的证据。红色回边连接相关证据。连续的同类消息会合并显示，所以节点编号可能跳跃。</w:t>
+      </w:r>
+    </w:p>
+    <w:p>
+      <w:pPr/>
+      <w:r>
+        <w:t>图上看似相同的 TOOL_CALLING 与 OBSERVING 序列，可能对应不同命令、不同结果和不同时间跨度。判断时应先看图上方的告警状态，再到“判错规则”核对阈值，并在“AWDL 分析”与“原始事件”按证据编号核查动作内容和时间。未触发告警表示现有证据不足，不保证任务目标已经实现。</w:t>
+      </w:r>
+    </w:p>
+    <w:p>
+      <w:pPr/>
+      <w:r>
+        <w:t>有效进展的保守定义是首次成功完成某一种动作签名，或进入成功终态；普通文字、推理阶段和重复完成同一动作通常不算新进展。当前规则识别可观察的结构性循环，不理解任务目标是否在语义上完成。</w:t>
+      </w:r>
+    </w:p>
+    <w:p>
+      <w:pPr/>
+      <w:r>
+        <w:t>当前默认规则包括：同一动作在最近 8 次工具调用中至少出现 3 次且持续至少 60 秒；2 至 4 步的无进展片段连续重复 2 次且至少持续 60 秒；最近 8 个事件跨越至少 180 秒、无进展且重复同一动作；连续 3 个错误；6 个事件中至少 4 个相同的规划或说明事件且持续至少 180 秒；未结束时静默 300 秒；超过 120 个事件且近期持续无进展。非法迁移仅在事件足够完整的来源上判断，会话文件旁路监听不使用该项。具体阈值以 formal/default-workflow.awdl.json 为准。</w:t>
+      </w:r>
+    </w:p>
+    <w:p>
+      <w:pPr>
+        <w:pStyle w:val="Heading2"/>
+      </w:pPr>
+      <w:r>
+        <w:t>2.6 真实 Agent 协同演练</w:t>
+      </w:r>
+    </w:p>
+    <w:p>
+      <w:pPr/>
+      <w:r>
+        <w:t>左侧提供“规划活锁”和“重复重试”两个真实交互按钮。监视器仅在当前 Codex Desktop 窗口标题能够唯一对应到所选 threadId，且窗口空闲时发送带 AWDL-SIM 标记的一次性只读演练协议。告警后可选择继续观察或终止 Agent。终止作用于当前可见会话，并记录请求与最终状态。</w:t>
+      </w:r>
+    </w:p>
+    <w:p>
+      <w:pPr/>
+      <w:r>
+        <w:t>演练完成、失败或中断时，服务端会广播明确的结束事件，界面恢复两个演练按钮并关闭已过期的告警确认框。启动请求返回时也会核对服务端运行状态，避免演练已结束而按钮仍被禁用。形式化检测验证按钮使用预设测试轨迹，与真实协同演练分开。</w:t>
+      </w:r>
+    </w:p>
+    <w:p>
+      <w:pPr>
         <w:pStyle w:val="Heading1"/>
         <w:pageBreakBefore/>
       </w:pPr>
@@ -1808,30 +1870,10 @@
             </w:tcMar>
           </w:tcPr>
           <w:p>
-            <w:pPr>
-              <w:spacing w:after="0"/>
-            </w:pPr>
             <w:r>
-              <w:rPr>
-                <w:rFonts w:ascii="Calibri" w:hAnsi="Calibri" w:eastAsia="Microsoft YaHei"/>
-                <w:b/>
-                <w:color w:val="0B2545"/>
-                <w:sz w:val="21"/>
-              </w:rPr>
               <w:t>多视图呈现</w:t>
-            </w:r>
-          </w:p>
-          <w:p>
-            <w:pPr>
-              <w:spacing w:after="0"/>
-            </w:pPr>
-            <w:r>
-              <w:rPr>
-                <w:rFonts w:ascii="Calibri" w:hAnsi="Calibri" w:eastAsia="Microsoft YaHei"/>
-                <w:color w:val="637083"/>
-                <w:sz w:val="18"/>
-              </w:rPr>
-              <w:t>前端按当前对话将同一事件流投影为工作流、逻辑、AWDL、通信和原始事件视图。</w:t>
+              <w:br/>
+              <w:t>前端按当前对话将同一事件流投影为工作流、判错规则、逻辑、AWDL、通信和原始事件六种视图。</w:t>
             </w:r>
           </w:p>
         </w:tc>
@@ -2163,16 +2205,8 @@
             </w:tcMar>
           </w:tcPr>
           <w:p>
-            <w:pPr>
-              <w:spacing w:after="0" w:line="259" w:lineRule="auto"/>
-            </w:pPr>
             <w:r>
-              <w:rPr>
-                <w:rFonts w:ascii="Calibri" w:hAnsi="Calibri" w:eastAsia="Microsoft YaHei"/>
-                <w:color w:val="26384B"/>
-                <w:sz w:val="19"/>
-              </w:rPr>
-              <w:t>前端状态管理、五视图渲染、筛选、告警与连接恢复。</w:t>
+              <w:t>前端状态管理、六视图渲染、筛选、告警与连接恢复。</w:t>
             </w:r>
           </w:p>
         </w:tc>
@@ -3418,7 +3452,7 @@
     <w:p>
       <w:pPr>
         <w:pStyle w:val="Heading1"/>
-        <w:pageBreakBefore/>
+        <w:pageBreakBefore w:val="0"/>
       </w:pPr>
       <w:r>
         <w:t>5. 运行、构建与分发</w:t>
@@ -4167,7 +4201,7 @@
         <w:pStyle w:val="ListBullet"/>
       </w:pPr>
       <w:r>
-        <w:t>对话映射不唯一、窗口忙碌或标题变化时拒绝执行主动演练。</w:t>
+        <w:t>对话映射不唯一、窗口忙碌或标题变化时拒绝执行主动演练；演练结束后恢复交互按钮。</w:t>
       </w:r>
     </w:p>
     <w:p>
@@ -4467,15 +4501,7 @@
             </w:tcMar>
           </w:tcPr>
           <w:p>
-            <w:pPr>
-              <w:spacing w:after="0" w:line="259" w:lineRule="auto"/>
-            </w:pPr>
             <w:r>
-              <w:rPr>
-                <w:rFonts w:ascii="Calibri" w:hAnsi="Calibri" w:eastAsia="Microsoft YaHei"/>
-                <w:color w:val="26384B"/>
-                <w:sz w:val="19"/>
-              </w:rPr>
               <w:t>Edge 为界面承载依赖</w:t>
             </w:r>
           </w:p>
@@ -4515,7 +4541,7 @@
     <w:p>
       <w:pPr>
         <w:pStyle w:val="Heading1"/>
-        <w:pageBreakBefore/>
+        <w:pageBreakBefore w:val="0"/>
       </w:pPr>
       <w:r>
         <w:t>7. 团队协作建议</w:t>
@@ -4542,7 +4568,7 @@
         <w:pStyle w:val="ListBullet"/>
       </w:pPr>
       <w:r>
-        <w:t>调整界面时，确认五个视图在切换对话和空数据状态下不会残留旧内容。</w:t>
+        <w:t>调整界面时，确认六个视图在切换对话和空数据状态下不会残留旧内容。</w:t>
       </w:r>
     </w:p>
     <w:p>
@@ -4578,25 +4604,8 @@
             <w:vAlign w:val="center"/>
           </w:tcPr>
           <w:p>
-            <w:pPr>
-              <w:pStyle w:val="Callout"/>
-            </w:pPr>
             <w:r>
-              <w:rPr>
-                <w:rFonts w:ascii="Calibri" w:hAnsi="Calibri" w:eastAsia="Microsoft YaHei"/>
-                <w:b/>
-                <w:color w:val="0B2545"/>
-                <w:sz w:val="21"/>
-              </w:rPr>
-              <w:t xml:space="preserve">交接结论  </w:t>
-            </w:r>
-            <w:r>
-              <w:rPr>
-                <w:rFonts w:ascii="Calibri" w:hAnsi="Calibri" w:eastAsia="Microsoft YaHei"/>
-                <w:color w:val="0B2545"/>
-                <w:sz w:val="21"/>
-              </w:rPr>
-              <w:t>当前版本已经具备完整的本地监听、分析、告警、双模式运行和便携构建链路，可作为后续规则扩展、界面优化和跨平台适配的稳定初版。</w:t>
+              <w:t>交接结论  当前版本已经具备完整的本地监听、分析、告警、双模式运行和便携构建链路，可作为后续规则扩展、界面优化和跨平台适配的持续迭代版本。</w:t>
             </w:r>
           </w:p>
         </w:tc>

</xml_diff>